<commit_message>
update test report Systemtest
</commit_message>
<xml_diff>
--- a/Project-organisation/Arbeitspakete.docx
+++ b/Project-organisation/Arbeitspakete.docx
@@ -671,6 +671,9 @@
             <w:pPr>
               <w:jc w:val="center"/>
             </w:pPr>
+            <w:r>
+              <w:t>25.06.2025</w:t>
+            </w:r>
           </w:p>
         </w:tc>
         <w:tc>
@@ -682,7 +685,11 @@
             </w:tcBorders>
             <w:vAlign w:val="center"/>
           </w:tcPr>
-          <w:p/>
+          <w:p>
+            <w:r>
+              <w:t>Jan Benz</w:t>
+            </w:r>
+          </w:p>
         </w:tc>
         <w:tc>
           <w:tcPr>
@@ -693,7 +700,11 @@
             </w:tcBorders>
             <w:vAlign w:val="center"/>
           </w:tcPr>
-          <w:p/>
+          <w:p>
+            <w:r>
+              <w:t>Arbeitspakete hinzugefügt</w:t>
+            </w:r>
+          </w:p>
         </w:tc>
       </w:tr>
     </w:tbl>
@@ -5973,7 +5984,7 @@
               <w:spacing w:after="0" w:line="240" w:lineRule="auto"/>
             </w:pPr>
             <w:r>
-              <w:br/>
+              <w:t>Jan Benz</w:t>
             </w:r>
           </w:p>
         </w:tc>
@@ -6189,7 +6200,7 @@
               <w:spacing w:after="0" w:line="240" w:lineRule="auto"/>
             </w:pPr>
             <w:r>
-              <w:br/>
+              <w:t>Jan Benz</w:t>
             </w:r>
           </w:p>
         </w:tc>
@@ -6404,6 +6415,9 @@
               <w:widowControl w:val="0"/>
               <w:spacing w:after="0" w:line="240" w:lineRule="auto"/>
             </w:pPr>
+            <w:r>
+              <w:t>Jan Benz</w:t>
+            </w:r>
             <w:r>
               <w:br/>
             </w:r>

</xml_diff>

<commit_message>
update Testmanagment und Testfälle Komponententest 1
</commit_message>
<xml_diff>
--- a/Project-organisation/Arbeitspakete.docx
+++ b/Project-organisation/Arbeitspakete.docx
@@ -703,6 +703,78 @@
           <w:p>
             <w:r>
               <w:t>Arbeitspakete hinzugefügt</w:t>
+            </w:r>
+          </w:p>
+        </w:tc>
+      </w:tr>
+      <w:tr>
+        <w:trPr>
+          <w:trHeight w:val="677"/>
+          <w:jc w:val="center"/>
+        </w:trPr>
+        <w:tc>
+          <w:tcPr>
+            <w:tcW w:w="1270" w:type="dxa"/>
+            <w:tcBorders>
+              <w:top w:val="single" w:sz="12" w:space="0" w:color="000000"/>
+              <w:bottom w:val="single" w:sz="12" w:space="0" w:color="000000"/>
+            </w:tcBorders>
+            <w:vAlign w:val="center"/>
+          </w:tcPr>
+          <w:p>
+            <w:pPr>
+              <w:jc w:val="center"/>
+            </w:pPr>
+            <w:r>
+              <w:t>0.5</w:t>
+            </w:r>
+          </w:p>
+        </w:tc>
+        <w:tc>
+          <w:tcPr>
+            <w:tcW w:w="1559" w:type="dxa"/>
+            <w:tcBorders>
+              <w:top w:val="single" w:sz="12" w:space="0" w:color="000000"/>
+              <w:bottom w:val="single" w:sz="12" w:space="0" w:color="000000"/>
+            </w:tcBorders>
+            <w:vAlign w:val="center"/>
+          </w:tcPr>
+          <w:p>
+            <w:pPr>
+              <w:jc w:val="center"/>
+            </w:pPr>
+            <w:r>
+              <w:t>26.06.2025</w:t>
+            </w:r>
+          </w:p>
+        </w:tc>
+        <w:tc>
+          <w:tcPr>
+            <w:tcW w:w="2128" w:type="dxa"/>
+            <w:tcBorders>
+              <w:top w:val="single" w:sz="12" w:space="0" w:color="000000"/>
+              <w:bottom w:val="single" w:sz="12" w:space="0" w:color="000000"/>
+            </w:tcBorders>
+            <w:vAlign w:val="center"/>
+          </w:tcPr>
+          <w:p>
+            <w:r>
+              <w:t>Donart Bazaj</w:t>
+            </w:r>
+          </w:p>
+        </w:tc>
+        <w:tc>
+          <w:tcPr>
+            <w:tcW w:w="4105" w:type="dxa"/>
+            <w:tcBorders>
+              <w:top w:val="single" w:sz="12" w:space="0" w:color="000000"/>
+              <w:bottom w:val="single" w:sz="12" w:space="0" w:color="000000"/>
+            </w:tcBorders>
+            <w:vAlign w:val="center"/>
+          </w:tcPr>
+          <w:p>
+            <w:r>
+              <w:t>Arbeitspakete aktualisert</w:t>
             </w:r>
           </w:p>
         </w:tc>
@@ -2327,6 +2399,7 @@
               <w:spacing w:after="0" w:line="240" w:lineRule="auto"/>
             </w:pPr>
             <w:r>
+              <w:lastRenderedPageBreak/>
               <w:t>Beschreibung:</w:t>
             </w:r>
           </w:p>
@@ -2363,7 +2436,6 @@
               <w:spacing w:after="0" w:line="240" w:lineRule="auto"/>
             </w:pPr>
             <w:r>
-              <w:lastRenderedPageBreak/>
               <w:t>Ziel: Die Timeline für das gesamte Projekt wurde erstellt.</w:t>
             </w:r>
           </w:p>
@@ -3183,6 +3255,7 @@
               <w:spacing w:after="0" w:line="240" w:lineRule="auto"/>
             </w:pPr>
             <w:r>
+              <w:lastRenderedPageBreak/>
               <w:t>Beschreibung:</w:t>
             </w:r>
           </w:p>
@@ -3225,7 +3298,6 @@
               <w:spacing w:after="0" w:line="240" w:lineRule="auto"/>
             </w:pPr>
             <w:r>
-              <w:lastRenderedPageBreak/>
               <w:t>Ziel: Alle Systemtests wurden erstellt</w:t>
             </w:r>
           </w:p>
@@ -3960,6 +4032,7 @@
               <w:spacing w:after="0" w:line="240" w:lineRule="auto"/>
             </w:pPr>
             <w:r>
+              <w:lastRenderedPageBreak/>
               <w:t>4.1</w:t>
             </w:r>
           </w:p>
@@ -3981,6 +4054,7 @@
               <w:spacing w:after="0" w:line="240" w:lineRule="auto"/>
             </w:pPr>
             <w:r>
+              <w:lastRenderedPageBreak/>
               <w:t>Name:</w:t>
             </w:r>
           </w:p>
@@ -3990,6 +4064,7 @@
               <w:spacing w:after="0" w:line="240" w:lineRule="auto"/>
             </w:pPr>
             <w:r>
+              <w:lastRenderedPageBreak/>
               <w:t>FeinDesign</w:t>
             </w:r>
           </w:p>
@@ -4020,6 +4095,7 @@
               <w:spacing w:after="0" w:line="240" w:lineRule="auto"/>
             </w:pPr>
             <w:r>
+              <w:lastRenderedPageBreak/>
               <w:t>Verantwortliche:</w:t>
             </w:r>
           </w:p>
@@ -4029,6 +4105,7 @@
               <w:spacing w:after="0" w:line="240" w:lineRule="auto"/>
             </w:pPr>
             <w:r>
+              <w:lastRenderedPageBreak/>
               <w:t>Nadine Bichler</w:t>
             </w:r>
             <w:r>
@@ -4053,6 +4130,7 @@
               <w:spacing w:after="0" w:line="240" w:lineRule="auto"/>
             </w:pPr>
             <w:r>
+              <w:lastRenderedPageBreak/>
               <w:t>Fälligkeitsdatum:</w:t>
             </w:r>
           </w:p>
@@ -4062,6 +4140,7 @@
               <w:spacing w:after="0" w:line="240" w:lineRule="auto"/>
             </w:pPr>
             <w:r>
+              <w:lastRenderedPageBreak/>
               <w:t>25.05.2025</w:t>
             </w:r>
           </w:p>
@@ -4089,6 +4168,7 @@
               <w:spacing w:after="0" w:line="240" w:lineRule="auto"/>
             </w:pPr>
             <w:r>
+              <w:lastRenderedPageBreak/>
               <w:t>Beschreibung:</w:t>
             </w:r>
           </w:p>
@@ -4098,7 +4178,6 @@
               <w:spacing w:after="0" w:line="240" w:lineRule="auto"/>
             </w:pPr>
             <w:r>
-              <w:lastRenderedPageBreak/>
               <w:t>Das Dokument Architektur.docx wurde mit SW-Spec 2 erweitert.</w:t>
             </w:r>
           </w:p>
@@ -4126,7 +4205,6 @@
               <w:spacing w:after="0" w:line="240" w:lineRule="auto"/>
             </w:pPr>
             <w:r>
-              <w:lastRenderedPageBreak/>
               <w:t>Ziel: Das Dokument Architektur.docx wurde fertiggestellt.</w:t>
             </w:r>
           </w:p>
@@ -4247,6 +4325,9 @@
             <w:r>
               <w:br/>
             </w:r>
+            <w:r>
+              <w:t>Donart Bazaj</w:t>
+            </w:r>
           </w:p>
         </w:tc>
         <w:tc>
@@ -4812,6 +4893,7 @@
               <w:spacing w:after="0" w:line="240" w:lineRule="auto"/>
             </w:pPr>
             <w:r>
+              <w:lastRenderedPageBreak/>
               <w:t xml:space="preserve">PSP-Code: </w:t>
             </w:r>
           </w:p>
@@ -4821,7 +4903,6 @@
               <w:spacing w:after="0" w:line="240" w:lineRule="auto"/>
             </w:pPr>
             <w:r>
-              <w:lastRenderedPageBreak/>
               <w:t>5.3</w:t>
             </w:r>
           </w:p>
@@ -4843,7 +4924,6 @@
               <w:spacing w:after="0" w:line="240" w:lineRule="auto"/>
             </w:pPr>
             <w:r>
-              <w:lastRenderedPageBreak/>
               <w:t>Name:</w:t>
             </w:r>
           </w:p>
@@ -4853,7 +4933,6 @@
               <w:spacing w:after="0" w:line="240" w:lineRule="auto"/>
             </w:pPr>
             <w:r>
-              <w:lastRenderedPageBreak/>
               <w:t xml:space="preserve">GUI </w:t>
             </w:r>
           </w:p>
@@ -4875,7 +4954,6 @@
               <w:spacing w:after="0" w:line="240" w:lineRule="auto"/>
             </w:pPr>
             <w:r>
-              <w:lastRenderedPageBreak/>
               <w:t>Verantwortliche:</w:t>
             </w:r>
           </w:p>
@@ -4885,7 +4963,6 @@
               <w:spacing w:after="0" w:line="240" w:lineRule="auto"/>
             </w:pPr>
             <w:r>
-              <w:lastRenderedPageBreak/>
               <w:t>Jan Benz</w:t>
             </w:r>
             <w:r>
@@ -4910,7 +4987,6 @@
               <w:spacing w:after="0" w:line="240" w:lineRule="auto"/>
             </w:pPr>
             <w:r>
-              <w:lastRenderedPageBreak/>
               <w:t>Fälligkeitsdatum:</w:t>
             </w:r>
           </w:p>
@@ -4920,7 +4996,6 @@
               <w:spacing w:after="0" w:line="240" w:lineRule="auto"/>
             </w:pPr>
             <w:r>
-              <w:lastRenderedPageBreak/>
               <w:t>25.06.2025</w:t>
             </w:r>
           </w:p>
@@ -4948,7 +5023,6 @@
               <w:spacing w:after="0" w:line="240" w:lineRule="auto"/>
             </w:pPr>
             <w:r>
-              <w:lastRenderedPageBreak/>
               <w:t>Beschreibung:</w:t>
             </w:r>
           </w:p>
@@ -5643,6 +5717,7 @@
               <w:spacing w:after="0" w:line="240" w:lineRule="auto"/>
             </w:pPr>
             <w:r>
+              <w:lastRenderedPageBreak/>
               <w:t>Ziel: In der GUI können die letzten Sprachbefehle gesehen werden</w:t>
             </w:r>
           </w:p>
@@ -6476,6 +6551,7 @@
               <w:spacing w:after="0" w:line="240" w:lineRule="auto"/>
             </w:pPr>
             <w:r>
+              <w:lastRenderedPageBreak/>
               <w:t>Beschreibung:</w:t>
             </w:r>
           </w:p>
@@ -6518,7 +6594,6 @@
               <w:spacing w:after="0" w:line="240" w:lineRule="auto"/>
             </w:pPr>
             <w:r>
-              <w:lastRenderedPageBreak/>
               <w:t>Ziel: Dokument fertiggestellt</w:t>
             </w:r>
           </w:p>
@@ -7185,6 +7260,7 @@
     </w:tbl>
     <w:p/>
     <w:p/>
+    <w:p/>
     <w:tbl>
       <w:tblPr>
         <w:tblStyle w:val="afe"/>
@@ -7264,32 +7340,27 @@
               <w:spacing w:after="0" w:line="240" w:lineRule="auto"/>
             </w:pPr>
             <w:r>
-              <w:t xml:space="preserve">Testmanagement </w:t>
-            </w:r>
-            <w:r>
-              <w:lastRenderedPageBreak/>
-              <w:t>Aktivitäten</w:t>
-            </w:r>
-          </w:p>
-        </w:tc>
-        <w:tc>
-          <w:tcPr>
-            <w:tcW w:w="2267" w:type="dxa"/>
-            <w:shd w:val="clear" w:color="auto" w:fill="auto"/>
-            <w:tcMar>
-              <w:top w:w="100" w:type="dxa"/>
-              <w:left w:w="100" w:type="dxa"/>
-              <w:bottom w:w="100" w:type="dxa"/>
-              <w:right w:w="100" w:type="dxa"/>
-            </w:tcMar>
-          </w:tcPr>
-          <w:p>
-            <w:pPr>
-              <w:widowControl w:val="0"/>
-              <w:spacing w:after="0" w:line="240" w:lineRule="auto"/>
-            </w:pPr>
-            <w:r>
-              <w:lastRenderedPageBreak/>
+              <w:t>Testmanagement Aktivitäten</w:t>
+            </w:r>
+          </w:p>
+        </w:tc>
+        <w:tc>
+          <w:tcPr>
+            <w:tcW w:w="2267" w:type="dxa"/>
+            <w:shd w:val="clear" w:color="auto" w:fill="auto"/>
+            <w:tcMar>
+              <w:top w:w="100" w:type="dxa"/>
+              <w:left w:w="100" w:type="dxa"/>
+              <w:bottom w:w="100" w:type="dxa"/>
+              <w:right w:w="100" w:type="dxa"/>
+            </w:tcMar>
+          </w:tcPr>
+          <w:p>
+            <w:pPr>
+              <w:widowControl w:val="0"/>
+              <w:spacing w:after="0" w:line="240" w:lineRule="auto"/>
+            </w:pPr>
+            <w:r>
               <w:t>Verantwortliche:</w:t>
             </w:r>
           </w:p>
@@ -7298,29 +7369,34 @@
               <w:widowControl w:val="0"/>
               <w:spacing w:after="0" w:line="240" w:lineRule="auto"/>
             </w:pPr>
-            <w:r>
-              <w:br/>
-            </w:r>
-          </w:p>
-        </w:tc>
-        <w:tc>
-          <w:tcPr>
-            <w:tcW w:w="2267" w:type="dxa"/>
-            <w:shd w:val="clear" w:color="auto" w:fill="auto"/>
-            <w:tcMar>
-              <w:top w:w="100" w:type="dxa"/>
-              <w:left w:w="100" w:type="dxa"/>
-              <w:bottom w:w="100" w:type="dxa"/>
-              <w:right w:w="100" w:type="dxa"/>
-            </w:tcMar>
-          </w:tcPr>
-          <w:p>
-            <w:pPr>
-              <w:widowControl w:val="0"/>
-              <w:spacing w:after="0" w:line="240" w:lineRule="auto"/>
-            </w:pPr>
-            <w:r>
-              <w:lastRenderedPageBreak/>
+          </w:p>
+          <w:p>
+            <w:pPr>
+              <w:widowControl w:val="0"/>
+              <w:spacing w:after="0" w:line="240" w:lineRule="auto"/>
+            </w:pPr>
+            <w:r>
+              <w:t>Donart Bazaj</w:t>
+            </w:r>
+          </w:p>
+        </w:tc>
+        <w:tc>
+          <w:tcPr>
+            <w:tcW w:w="2267" w:type="dxa"/>
+            <w:shd w:val="clear" w:color="auto" w:fill="auto"/>
+            <w:tcMar>
+              <w:top w:w="100" w:type="dxa"/>
+              <w:left w:w="100" w:type="dxa"/>
+              <w:bottom w:w="100" w:type="dxa"/>
+              <w:right w:w="100" w:type="dxa"/>
+            </w:tcMar>
+          </w:tcPr>
+          <w:p>
+            <w:pPr>
+              <w:widowControl w:val="0"/>
+              <w:spacing w:after="0" w:line="240" w:lineRule="auto"/>
+            </w:pPr>
+            <w:r>
               <w:t>Fälligkeitsdatum:</w:t>
             </w:r>
           </w:p>

</xml_diff>

<commit_message>
update Testmanagment und Komponententest 1 Arbeitspakete.docx
</commit_message>
<xml_diff>
--- a/Project-organisation/Arbeitspakete.docx
+++ b/Project-organisation/Arbeitspakete.docx
@@ -774,7 +774,10 @@
           </w:tcPr>
           <w:p>
             <w:r>
-              <w:t>Arbeitspakete aktualisert</w:t>
+              <w:t xml:space="preserve">Arbeitspakete </w:t>
+            </w:r>
+            <w:r>
+              <w:t>aktualisiert</w:t>
             </w:r>
           </w:p>
         </w:tc>

</xml_diff>